<commit_message>
Redline refreshed through lock 6
Co-Authored-By: Claude Fable 5.1 <noreply@anthropic.com>
Claude-Session: https://claude.ai/code/session_013TTacQAr67Pe2VUwTPop1A
</commit_message>
<xml_diff>
--- a/The_Cardinals_Promise_Redline_for_Scott.docx
+++ b/The_Cardinals_Promise_Redline_for_Scott.docx
@@ -3816,9 +3816,10 @@
     <w:p>
       <w:r>
         <w:rPr>
-          <w:b w:val="0"/>
-        </w:rPr>
-        <w:t>If he was in pain he wouldn't use the word.</w:t>
+          <w:strike/>
+          <w:color w:val="C00000"/>
+        </w:rPr>
+        <w:t xml:space="preserve">If he was in pain he wouldn't use the word. </w:t>
       </w:r>
     </w:p>
     <w:p>
@@ -3924,109 +3925,70 @@
     </w:p>
     <w:p>
       <w:r>
-        <w:rPr>
-          <w:b w:val="0"/>
-        </w:rPr>
-        <w:t>Nesser filmed a bio of me wakeboarding in Islamorada, Florida. The tape brought an A&amp;F talent scout to the store, and I got picked for Abercrombie &amp; Fitch TV, the in-store channel playing across the country. That was the commercial Angela had seen. The kid from Mexico City who had needed speech therapy for a lisp was now on a loop in one of the biggest retail brands in America.</w:t>
-      </w:r>
-    </w:p>
-    <w:p>
-      <w:r>
-        <w:t xml:space="preserve">The hunger stayed. I transferred to the highest-grossing Abercrombie in the country, in Newport Beach. Then came sales. Then medical </w:t>
+        <w:t xml:space="preserve">Nesser filmed a bio of me wakeboarding in Islamorada, Florida. The tape brought an A&amp;F talent scout to the store, and I got picked for Abercrombie &amp; Fitch TV, the in-store channel playing across the country. That was the commercial Angela had seen. </w:t>
       </w:r>
       <w:r>
         <w:rPr>
           <w:strike/>
           <w:color w:val="C00000"/>
         </w:rPr>
-        <w:t xml:space="preserve">devices. </w:t>
+        <w:t xml:space="preserve">The </w:t>
       </w:r>
       <w:r>
         <w:rPr>
           <w:color w:val="C00000"/>
         </w:rPr>
-        <w:t xml:space="preserve">devices, the job I'd always wanted, pharma or devices, where the top guys made upwards of three hundred thousand. Every move felt like a rung on the ladder. </w:t>
-      </w:r>
-      <w:r>
-        <w:t xml:space="preserve">By twenty-four, I was clearing six figures. </w:t>
-      </w:r>
-    </w:p>
-    <w:p>
+        <w:t xml:space="preserve">I was the </w:t>
+      </w:r>
+      <w:r>
+        <w:t xml:space="preserve">kid from Mexico City who had needed speech therapy for a </w:t>
+      </w:r>
       <w:r>
         <w:rPr>
           <w:strike/>
           <w:color w:val="C00000"/>
         </w:rPr>
-        <w:t xml:space="preserve">The Fraud Feeling </w:t>
-      </w:r>
-    </w:p>
-    <w:p>
-      <w:r>
-        <w:rPr>
-          <w:b w:val="0"/>
-        </w:rPr>
-        <w:t>The screen couldn't show what was underneath. I walked into every room certain everyone else was the real thing and I was the only fake. They belonged. I was getting away with something. I spent more energy guarding that secret than living my life.</w:t>
-      </w:r>
-    </w:p>
-    <w:p>
-      <w:r>
-        <w:rPr>
-          <w:b w:val="0"/>
-        </w:rPr>
-        <w:t>The secret was older than California. It went back to a four-year-old carried out of one country and set down in another — the new name at the top of my homework, the dark skin that didn't match the other kids, the lisp they sent me to therapy to fix. Somewhere along the way I reached a conclusion I couldn't yet name: this part of me is not welcome here. Claudio went quiet. I drowned him with liquor and pills.</w:t>
-      </w:r>
-    </w:p>
-    <w:p>
-      <w:r>
-        <w:rPr>
-          <w:b w:val="0"/>
-        </w:rPr>
-        <w:t>Chris seemed to avoid the same disease that took me. We had the same blood, same two fathers, same kitchen. Chris left Mexico at a year and a half. I was four. I had a papa who raced me to the corner and called me his good luck charm, and then I didn't. Chris grew up with one father. I grew up with one father and one ghost.</w:t>
-      </w:r>
-    </w:p>
-    <w:p>
-      <w:r>
-        <w:rPr>
-          <w:b w:val="0"/>
-        </w:rPr>
-        <w:t>I built a character in that empty space, and I built him well. Smoother. Funnier. More needed. The hard part is that it worked. People responded to him. Every time they did, the real one underneath got quieter.</w:t>
-      </w:r>
-    </w:p>
-    <w:p>
-      <w:r>
-        <w:t xml:space="preserve">Then it stacked — performance on performance, year after year — until I forgot there was anyone underneath the costume. Close your eyes and try to imagine Bob Denver from Gilligan's Island playing any other role. As an actor, I'm sure he could have created other characters. But I couldn't. I was </w:t>
+        <w:t xml:space="preserve">lisp </w:t>
+      </w:r>
+      <w:r>
+        <w:rPr>
+          <w:color w:val="C00000"/>
+        </w:rPr>
+        <w:t xml:space="preserve">lisp, and now I </w:t>
+      </w:r>
+      <w:r>
+        <w:t xml:space="preserve">was </w:t>
       </w:r>
       <w:r>
         <w:rPr>
           <w:strike/>
           <w:color w:val="C00000"/>
         </w:rPr>
-        <w:t xml:space="preserve">not </w:t>
-      </w:r>
-      <w:r>
-        <w:rPr>
-          <w:color w:val="C00000"/>
-        </w:rPr>
-        <w:t xml:space="preserve">no </w:t>
-      </w:r>
-      <w:r>
-        <w:t xml:space="preserve">longer playing a part. I became the role I projected to others. The only times I wasn't </w:t>
+        <w:t xml:space="preserve">now </w:t>
+      </w:r>
+      <w:r>
+        <w:t xml:space="preserve">on a loop in one of the biggest retail brands in America. </w:t>
+      </w:r>
+    </w:p>
+    <w:p>
+      <w:r>
+        <w:t xml:space="preserve">The hunger stayed. I transferred to the highest-grossing Abercrombie in the country, in Newport Beach. Then came sales. Then medical </w:t>
       </w:r>
       <w:r>
         <w:rPr>
           <w:strike/>
           <w:color w:val="C00000"/>
         </w:rPr>
-        <w:t xml:space="preserve">play acting was </w:t>
+        <w:t xml:space="preserve">devices. </w:t>
       </w:r>
       <w:r>
         <w:rPr>
           <w:color w:val="C00000"/>
         </w:rPr>
-        <w:t xml:space="preserve">play-acting were </w:t>
-      </w:r>
-      <w:r>
-        <w:t xml:space="preserve">when I was alone with my thoughts. Which wasn't often. </w:t>
+        <w:t xml:space="preserve">devices, the job I'd always wanted, pharma or devices, where the top guys made upwards of three hundred thousand. Every move felt like a rung on the ladder. </w:t>
+      </w:r>
+      <w:r>
+        <w:t xml:space="preserve">By twenty-four, I was clearing six figures. </w:t>
       </w:r>
     </w:p>
     <w:p>
@@ -4035,101 +3997,131 @@
           <w:strike/>
           <w:color w:val="C00000"/>
         </w:rPr>
-        <w:t xml:space="preserve">Sales </w:t>
-      </w:r>
-      <w:r>
-        <w:rPr>
-          <w:color w:val="C00000"/>
-        </w:rPr>
-        <w:t xml:space="preserve">I took a sales job in 2002. Abercrombie paid me thirty thousand a year. The uniform company offered fifty base, thirty more in commission, and a car package, and it looked like the next step up, into business-to-business sales. For a while it felt like proof California hadn't broken me. At twenty-three it felt like solid ground for the first time in years. </w:t>
-      </w:r>
-    </w:p>
-    <w:p>
-      <w:r>
-        <w:rPr>
-          <w:color w:val="C00000"/>
-        </w:rPr>
-        <w:t xml:space="preserve">The job was selling uniform services to businesses: cold calls, presentations, lunches in parking lots while </w:t>
-      </w:r>
-      <w:r>
-        <w:t xml:space="preserve">I </w:t>
+        <w:t xml:space="preserve">The Fraud Feeling </w:t>
+      </w:r>
+    </w:p>
+    <w:p>
+      <w:r>
+        <w:rPr>
+          <w:b w:val="0"/>
+        </w:rPr>
+        <w:t>The screen couldn't show what was underneath. I walked into every room certain everyone else was the real thing and I was the only fake. They belonged. I was getting away with something. I spent more energy guarding that secret than living my life.</w:t>
+      </w:r>
+    </w:p>
+    <w:p>
+      <w:r>
+        <w:rPr>
+          <w:b w:val="0"/>
+        </w:rPr>
+        <w:t>The secret was older than California. It went back to a four-year-old carried out of one country and set down in another — the new name at the top of my homework, the dark skin that didn't match the other kids, the lisp they sent me to therapy to fix. Somewhere along the way I reached a conclusion I couldn't yet name: this part of me is not welcome here. Claudio went quiet. I drowned him with liquor and pills.</w:t>
+      </w:r>
+    </w:p>
+    <w:p>
+      <w:r>
+        <w:rPr>
+          <w:b w:val="0"/>
+        </w:rPr>
+        <w:t>Chris seemed to avoid the same disease that took me. We had the same blood, same two fathers, same kitchen. Chris left Mexico at a year and a half. I was four. I had a papa who raced me to the corner and called me his good luck charm, and then I didn't. Chris grew up with one father. I grew up with one father and one ghost.</w:t>
+      </w:r>
+    </w:p>
+    <w:p>
+      <w:r>
+        <w:rPr>
+          <w:b w:val="0"/>
+        </w:rPr>
+        <w:t>I built a character in that empty space, and I built him well. Smoother. Funnier. More needed. The hard part is that it worked. People responded to him. Every time they did, the real one underneath got quieter.</w:t>
+      </w:r>
+    </w:p>
+    <w:p>
+      <w:r>
+        <w:t xml:space="preserve">Then it stacked — performance on performance, year after year — until I forgot there was anyone underneath the costume. Close your eyes and try to imagine Bob Denver from Gilligan's Island playing any other role. As an actor, I'm sure he could have created other characters. But I couldn't. I was </w:t>
       </w:r>
       <w:r>
         <w:rPr>
           <w:strike/>
           <w:color w:val="C00000"/>
         </w:rPr>
-        <w:t xml:space="preserve">took </w:t>
+        <w:t xml:space="preserve">not </w:t>
       </w:r>
       <w:r>
         <w:rPr>
           <w:color w:val="C00000"/>
         </w:rPr>
-        <w:t xml:space="preserve">ran the next hour in my head. The quota was real. Your manager knew your numbers before breakfast. I loved the structure — clear rules, clear targets, </w:t>
-      </w:r>
-      <w:r>
-        <w:t xml:space="preserve">a </w:t>
+        <w:t xml:space="preserve">no </w:t>
+      </w:r>
+      <w:r>
+        <w:t xml:space="preserve">longer playing a part. I became the role I projected to others. The only times I wasn't </w:t>
       </w:r>
       <w:r>
         <w:rPr>
           <w:strike/>
           <w:color w:val="C00000"/>
         </w:rPr>
-        <w:t xml:space="preserve">sales job </w:t>
+        <w:t xml:space="preserve">play acting was </w:t>
       </w:r>
       <w:r>
         <w:rPr>
           <w:color w:val="C00000"/>
         </w:rPr>
-        <w:t xml:space="preserve">scoreboard that updated every day. Lou had raised me </w:t>
-      </w:r>
-      <w:r>
-        <w:t xml:space="preserve">in </w:t>
-      </w:r>
+        <w:t xml:space="preserve">play-acting were </w:t>
+      </w:r>
+      <w:r>
+        <w:t xml:space="preserve">when I was alone with my thoughts. Which wasn't often. </w:t>
+      </w:r>
+    </w:p>
+    <w:p>
       <w:r>
         <w:rPr>
           <w:strike/>
           <w:color w:val="C00000"/>
         </w:rPr>
-        <w:t xml:space="preserve">2002. For a while it felt like proof California hadn't broken me. The salary was fifty thousand dollars, </w:t>
+        <w:t xml:space="preserve">Sales </w:t>
       </w:r>
       <w:r>
         <w:rPr>
           <w:color w:val="C00000"/>
         </w:rPr>
-        <w:t xml:space="preserve">the language of milestones </w:t>
-      </w:r>
-      <w:r>
-        <w:t xml:space="preserve">and </w:t>
+        <w:t xml:space="preserve">I took a sales job in 2002. Abercrombie paid me thirty thousand a year. The uniform company offered fifty base, thirty more in commission, and a car package, and it looked like the next step up, into business-to-business sales. For a while it felt like proof California hadn't broken me. At twenty-three it felt like solid ground for the first time in years. </w:t>
+      </w:r>
+    </w:p>
+    <w:p>
+      <w:r>
+        <w:rPr>
+          <w:color w:val="C00000"/>
+        </w:rPr>
+        <w:t xml:space="preserve">The job was selling uniform services to businesses: cold calls, presentations, lunches in parking lots while </w:t>
+      </w:r>
+      <w:r>
+        <w:t xml:space="preserve">I </w:t>
       </w:r>
       <w:r>
         <w:rPr>
           <w:strike/>
           <w:color w:val="C00000"/>
         </w:rPr>
-        <w:t xml:space="preserve">at twenty-three it felt like solid ground for </w:t>
+        <w:t xml:space="preserve">took </w:t>
       </w:r>
       <w:r>
         <w:rPr>
           <w:color w:val="C00000"/>
         </w:rPr>
-        <w:t xml:space="preserve">metrics, where doing </w:t>
-      </w:r>
-      <w:r>
-        <w:t xml:space="preserve">the </w:t>
+        <w:t xml:space="preserve">ran the next hour in my head. The quota was real. Your manager knew your numbers before breakfast. I loved the structure — clear rules, clear targets, </w:t>
+      </w:r>
+      <w:r>
+        <w:t xml:space="preserve">a </w:t>
       </w:r>
       <w:r>
         <w:rPr>
           <w:strike/>
           <w:color w:val="C00000"/>
         </w:rPr>
-        <w:t xml:space="preserve">first time </w:t>
+        <w:t xml:space="preserve">sales job </w:t>
       </w:r>
       <w:r>
         <w:rPr>
           <w:color w:val="C00000"/>
         </w:rPr>
-        <w:t xml:space="preserve">work would show up </w:t>
+        <w:t xml:space="preserve">scoreboard that updated every day. Lou had raised me </w:t>
       </w:r>
       <w:r>
         <w:t xml:space="preserve">in </w:t>
@@ -4139,213 +4131,140 @@
           <w:strike/>
           <w:color w:val="C00000"/>
         </w:rPr>
-        <w:t xml:space="preserve">years. </w:t>
+        <w:t xml:space="preserve">2002. For a while it felt like proof California hadn't broken me. The salary was fifty thousand dollars, </w:t>
       </w:r>
       <w:r>
         <w:rPr>
           <w:color w:val="C00000"/>
         </w:rPr>
-        <w:t xml:space="preserve">the results. </w:t>
-      </w:r>
-    </w:p>
-    <w:p>
+        <w:t xml:space="preserve">the language of milestones </w:t>
+      </w:r>
+      <w:r>
+        <w:t xml:space="preserve">and </w:t>
+      </w:r>
       <w:r>
         <w:rPr>
           <w:strike/>
           <w:color w:val="C00000"/>
         </w:rPr>
-        <w:t xml:space="preserve">The job </w:t>
+        <w:t xml:space="preserve">at twenty-three it felt like solid ground for </w:t>
       </w:r>
       <w:r>
         <w:rPr>
           <w:color w:val="C00000"/>
         </w:rPr>
-        <w:t xml:space="preserve">For the first six months I </w:t>
-      </w:r>
-      <w:r>
-        <w:t xml:space="preserve">was </w:t>
+        <w:t xml:space="preserve">metrics, where doing </w:t>
+      </w:r>
+      <w:r>
+        <w:t xml:space="preserve">the </w:t>
       </w:r>
       <w:r>
         <w:rPr>
           <w:strike/>
           <w:color w:val="C00000"/>
         </w:rPr>
-        <w:t xml:space="preserve">selling uniform services to businesses: cold calls, presentations, lunches in parking lots while </w:t>
+        <w:t xml:space="preserve">first time </w:t>
       </w:r>
       <w:r>
         <w:rPr>
           <w:color w:val="C00000"/>
         </w:rPr>
-        <w:t xml:space="preserve">managing it. </w:t>
-      </w:r>
-      <w:r>
-        <w:t xml:space="preserve">I </w:t>
+        <w:t xml:space="preserve">work would show up </w:t>
+      </w:r>
+      <w:r>
+        <w:t xml:space="preserve">in </w:t>
       </w:r>
       <w:r>
         <w:rPr>
           <w:strike/>
           <w:color w:val="C00000"/>
         </w:rPr>
-        <w:t xml:space="preserve">ran </w:t>
+        <w:t xml:space="preserve">years. </w:t>
       </w:r>
       <w:r>
         <w:rPr>
           <w:color w:val="C00000"/>
         </w:rPr>
-        <w:t xml:space="preserve">called Lou on Sundays and gave him </w:t>
-      </w:r>
-      <w:r>
-        <w:t xml:space="preserve">the </w:t>
-      </w:r>
+        <w:t xml:space="preserve">the results. </w:t>
+      </w:r>
+    </w:p>
+    <w:p>
       <w:r>
         <w:rPr>
           <w:strike/>
           <w:color w:val="C00000"/>
         </w:rPr>
-        <w:t xml:space="preserve">next hour in my head. The quota was real. Your manager knew your numbers before breakfast. </w:t>
+        <w:t xml:space="preserve">The job </w:t>
       </w:r>
       <w:r>
         <w:rPr>
           <w:color w:val="C00000"/>
         </w:rPr>
-        <w:t xml:space="preserve">numbers. He never sounded as impressed as </w:t>
-      </w:r>
-      <w:r>
-        <w:t xml:space="preserve">I </w:t>
+        <w:t xml:space="preserve">For the first six months I </w:t>
+      </w:r>
+      <w:r>
+        <w:t xml:space="preserve">was </w:t>
       </w:r>
       <w:r>
         <w:rPr>
           <w:strike/>
           <w:color w:val="C00000"/>
         </w:rPr>
-        <w:t xml:space="preserve">loved the structure — clear rules, clear targets, a scoreboard that updated every day. Lou had raised me in the language of milestone and metrics where doing the work would show up in my results. </w:t>
+        <w:t xml:space="preserve">selling uniform services to businesses: cold calls, presentations, lunches in parking lots while </w:t>
       </w:r>
       <w:r>
         <w:rPr>
           <w:color w:val="C00000"/>
         </w:rPr>
-        <w:t xml:space="preserve">wanted him to. </w:t>
-      </w:r>
-    </w:p>
-    <w:p>
+        <w:t xml:space="preserve">managing it. </w:t>
+      </w:r>
+      <w:r>
+        <w:t xml:space="preserve">I </w:t>
+      </w:r>
       <w:r>
         <w:rPr>
           <w:strike/>
           <w:color w:val="C00000"/>
         </w:rPr>
-        <w:t xml:space="preserve">For the first six months I wasn't using. I called Lou on Sundays and gave him the numbers. He never sounded as impressed as I wanted him to. </w:t>
+        <w:t xml:space="preserve">ran </w:t>
       </w:r>
       <w:r>
         <w:rPr>
           <w:color w:val="C00000"/>
         </w:rPr>
-        <w:t xml:space="preserve">"You doing okay out there?" he'd ask. </w:t>
-      </w:r>
-    </w:p>
-    <w:p>
+        <w:t xml:space="preserve">called Lou on Sundays and gave him </w:t>
+      </w:r>
+      <w:r>
+        <w:t xml:space="preserve">the </w:t>
+      </w:r>
       <w:r>
         <w:rPr>
           <w:strike/>
           <w:color w:val="C00000"/>
         </w:rPr>
-        <w:t xml:space="preserve">"You doing okay out there?" He'd ask. </w:t>
-      </w:r>
-    </w:p>
-    <w:p>
-      <w:r>
-        <w:rPr>
-          <w:b w:val="0"/>
-        </w:rPr>
-        <w:t>"I'm doing great, Dad. Making more than I ever thought I would," I'd say, trying to get him to tell me he was proud of me or that he recognized my success.</w:t>
-      </w:r>
-    </w:p>
-    <w:p>
-      <w:r>
-        <w:rPr>
-          <w:b w:val="0"/>
-        </w:rPr>
-        <w:t>"Yeah, that's good. But are you happy?"</w:t>
-      </w:r>
-    </w:p>
-    <w:p>
-      <w:r>
-        <w:rPr>
-          <w:b w:val="0"/>
-        </w:rPr>
-        <w:t>What's happiness got to do with it? I'm successful. Isn't that enough?</w:t>
-      </w:r>
-    </w:p>
-    <w:p>
+        <w:t xml:space="preserve">next hour in my head. The quota was real. Your manager knew your numbers before breakfast. </w:t>
+      </w:r>
+      <w:r>
+        <w:rPr>
+          <w:color w:val="C00000"/>
+        </w:rPr>
+        <w:t xml:space="preserve">numbers. He never sounded as impressed as </w:t>
+      </w:r>
+      <w:r>
+        <w:t xml:space="preserve">I </w:t>
+      </w:r>
       <w:r>
         <w:rPr>
           <w:strike/>
           <w:color w:val="C00000"/>
         </w:rPr>
-        <w:t>Started Using</w:t>
-      </w:r>
-    </w:p>
-    <w:p>
-      <w:r>
-        <w:rPr>
-          <w:b w:val="0"/>
-        </w:rPr>
-        <w:t>The pills came slowly. There was no single decision, just a long week, a rough stretch of no's, a body tired of being on all day and a brain that didn't know how to shut off at night. Once I started, I didn't stop.</w:t>
-      </w:r>
-    </w:p>
-    <w:p>
-      <w:r>
-        <w:rPr>
-          <w:b w:val="0"/>
-        </w:rPr>
-        <w:t>I already knew the feeling. I had met it in Oxford in 1999 and spent the years after graduation telling myself that was college. San Diego was different because I stopped waiting for the feeling to find me. Now there was a bottle, a reason, and a workday attached. The part of me always checking the room, always reading faces to know who to be, could be switched off on schedule. That was the change: not discovering the drug, but deciding to give it untethered access to my life.</w:t>
-      </w:r>
-    </w:p>
-    <w:p>
-      <w:r>
-        <w:rPr>
-          <w:b w:val="0"/>
-        </w:rPr>
-        <w:t>The pills were Adderall and Ritalin. Before a workday, I told myself they were practical. The noise went quiet. The static of self-doubt dropped a few decibels. I could hear the customer instead of pretending to listen while rehearsing my next line. I closed deals. I walked into rooms that scared me and stopped feeling scared. My numbers went up.</w:t>
-      </w:r>
-    </w:p>
-    <w:p>
-      <w:r>
-        <w:rPr>
-          <w:b w:val="0"/>
-        </w:rPr>
-        <w:t>And success was the trap. If every time I took a pill, I threw up my guts, blew a sales call, and missed the next couple of days at work, I would have seen the addiction for what it was: lethal. But those pills didn't just feel good; they made me better at the thing I most needed to be good at, with money attached. I didn't see it as using. I saw it as competing.</w:t>
-      </w:r>
-    </w:p>
-    <w:p>
-      <w:r>
-        <w:rPr>
-          <w:b w:val="0"/>
-        </w:rPr>
-        <w:t>By then I had my own prescription in California. Easy access didn't satisfy the chase; it amplified it. The arithmetic was simple: more to get the same effect, then more again. When California ran dry, I crossed into Tijuana to resupply. One of those runs resulted in where I started my story: in a jail wishing I could disappear against the wall.</w:t>
-      </w:r>
-    </w:p>
-    <w:p>
-      <w:r>
-        <w:rPr>
-          <w:b w:val="0"/>
-        </w:rPr>
-        <w:t>Did the experience of a fellow cellmate scaring the living crap out of me change my behavior? Sure. Until I got out.</w:t>
-      </w:r>
-    </w:p>
-    <w:p>
-      <w:r>
-        <w:rPr>
-          <w:b w:val="0"/>
-        </w:rPr>
-        <w:t>I crossed again the next day. Which wasn't logical behavior. But addiction doesn't listen to logic. Six figures a year, crossing a border for pills because the machine I had built couldn't run without fuel.</w:t>
-      </w:r>
-    </w:p>
-    <w:p>
-      <w:r>
-        <w:rPr>
-          <w:b w:val="0"/>
-        </w:rPr>
-        <w:t>Alcohol came alongside it. Pills to ramp up, drinks to come down. I wasn't a two-beer, loosen-up drinker. I blacked out. Four nights a week, I'd wake up piecing the night together from other people's faces. Outside, the confidence read as arrogance. Inside, I was still the scared kid trying to prove he belonged.</w:t>
+        <w:t xml:space="preserve">loved the structure — clear rules, clear targets, a scoreboard that updated every day. Lou had raised me in the language of milestone and metrics where doing the work would show up in my results. </w:t>
+      </w:r>
+      <w:r>
+        <w:rPr>
+          <w:color w:val="C00000"/>
+        </w:rPr>
+        <w:t xml:space="preserve">wanted him to. </w:t>
       </w:r>
     </w:p>
     <w:p>
@@ -4354,39 +4273,13 @@
           <w:strike/>
           <w:color w:val="C00000"/>
         </w:rPr>
-        <w:t>The Wreckage</w:t>
-      </w:r>
-    </w:p>
-    <w:p>
-      <w:r>
-        <w:rPr>
-          <w:b w:val="0"/>
-        </w:rPr>
-        <w:t>By then, the thing I was feeding had swallowed most of me. I lied with my own face. I hurt people who loved me and still found ways to explain it away.</w:t>
-      </w:r>
-    </w:p>
-    <w:p>
-      <w:r>
-        <w:rPr>
-          <w:b w:val="0"/>
-        </w:rPr>
-        <w:t>There's one moment from California I can't shake. On a workday, I went to see a fortune teller. I don't even believe in them. She looked at me and said my mother cried herself to sleep worrying about me and my father was sick with concern. I sat there stunned. How could she know? Maybe it was written plainly enough on me for a stranger to read.</w:t>
-      </w:r>
-    </w:p>
-    <w:p>
-      <w:r>
-        <w:rPr>
-          <w:b w:val="0"/>
-        </w:rPr>
-        <w:t>But what the fortune teller told me was true. While I chased a feeling, the people who loved me lay awake. My mother. Nancey. Lou. Chris. I lied to them. Manipulated them. Stole. I turned their trust into fuel and left them carrying a wreckage I barely looked back at.</w:t>
-      </w:r>
-    </w:p>
-    <w:p>
-      <w:r>
-        <w:rPr>
-          <w:b w:val="0"/>
-        </w:rPr>
-        <w:t>Some of it I would make right later. Some of it I still carry.</w:t>
+        <w:t xml:space="preserve">For the first six months I wasn't using. I called Lou on Sundays and gave him the numbers. He never sounded as impressed as I wanted him to. </w:t>
+      </w:r>
+      <w:r>
+        <w:rPr>
+          <w:color w:val="C00000"/>
+        </w:rPr>
+        <w:t xml:space="preserve">"You doing okay out there?" he'd ask. </w:t>
       </w:r>
     </w:p>
     <w:p>
@@ -4395,92 +4288,239 @@
           <w:strike/>
           <w:color w:val="C00000"/>
         </w:rPr>
-        <w:t>The First DUI</w:t>
-      </w:r>
-    </w:p>
-    <w:p>
-      <w:r>
-        <w:rPr>
-          <w:b w:val="0"/>
-        </w:rPr>
-        <w:t>The first DUI came in 2002, and it should have stopped me. I was driving toward San Diego to see an ex-girlfriend I wasn't even in love with, holding on because letting go felt like defeat. I had been drinking. I was exhausted, strung out from work, running on momentum.</w:t>
-      </w:r>
-    </w:p>
-    <w:p>
-      <w:r>
-        <w:rPr>
-          <w:b w:val="0"/>
-        </w:rPr>
-        <w:t>I got so tired I pulled onto the shoulder near Camp Pendleton and fell asleep with the car running. Military police found me and called the cops. I tried the old pennies-in-the-mouth trick. It doesn't work.</w:t>
-      </w:r>
-    </w:p>
-    <w:p>
-      <w:r>
-        <w:rPr>
-          <w:b w:val="0"/>
-        </w:rPr>
-        <w:t>I woke up in handcuffs. The car was impounded. I spent the night in jail.</w:t>
-      </w:r>
-    </w:p>
-    <w:p>
-      <w:r>
-        <w:rPr>
-          <w:b w:val="0"/>
-        </w:rPr>
-        <w:t>The next morning, I called my boss from a payphone, my hands still shaking.</w:t>
-      </w:r>
-    </w:p>
-    <w:p>
-      <w:r>
-        <w:t xml:space="preserve">"Am I going to lose my job?" I asked </w:t>
-      </w:r>
+        <w:t xml:space="preserve">"You doing okay out there?" He'd ask. </w:t>
+      </w:r>
+    </w:p>
+    <w:p>
+      <w:r>
+        <w:rPr>
+          <w:b w:val="0"/>
+        </w:rPr>
+        <w:t>"I'm doing great, Dad. Making more than I ever thought I would," I'd say, trying to get him to tell me he was proud of me or that he recognized my success.</w:t>
+      </w:r>
+    </w:p>
+    <w:p>
+      <w:r>
+        <w:rPr>
+          <w:b w:val="0"/>
+        </w:rPr>
+        <w:t>"Yeah, that's good. But are you happy?"</w:t>
+      </w:r>
+    </w:p>
+    <w:p>
+      <w:r>
+        <w:rPr>
+          <w:b w:val="0"/>
+        </w:rPr>
+        <w:t>What's happiness got to do with it? I'm successful. Isn't that enough?</w:t>
+      </w:r>
+    </w:p>
+    <w:p>
       <w:r>
         <w:rPr>
           <w:strike/>
           <w:color w:val="C00000"/>
         </w:rPr>
-        <w:t xml:space="preserve">my boss </w:t>
-      </w:r>
-      <w:r>
-        <w:rPr>
-          <w:color w:val="C00000"/>
-        </w:rPr>
-        <w:t xml:space="preserve">him </w:t>
-      </w:r>
-      <w:r>
-        <w:t xml:space="preserve">while fighting back tears. The situation had broken me. And by situation, I mean getting caught. </w:t>
-      </w:r>
-    </w:p>
-    <w:p>
-      <w:r>
-        <w:t xml:space="preserve">"I don't know yet, Bravo," he answered, using my work nickname. </w:t>
-      </w:r>
+        <w:t>Started Using</w:t>
+      </w:r>
+    </w:p>
+    <w:p>
+      <w:r>
+        <w:rPr>
+          <w:b w:val="0"/>
+        </w:rPr>
+        <w:t>The pills came slowly. There was no single decision, just a long week, a rough stretch of no's, a body tired of being on all day and a brain that didn't know how to shut off at night. Once I started, I didn't stop.</w:t>
+      </w:r>
+    </w:p>
+    <w:p>
+      <w:r>
+        <w:rPr>
+          <w:b w:val="0"/>
+        </w:rPr>
+        <w:t>I already knew the feeling. I had met it in Oxford in 1999 and spent the years after graduation telling myself that was college. San Diego was different because I stopped waiting for the feeling to find me. Now there was a bottle, a reason, and a workday attached. The part of me always checking the room, always reading faces to know who to be, could be switched off on schedule. That was the change: not discovering the drug, but deciding to give it untethered access to my life.</w:t>
+      </w:r>
+    </w:p>
+    <w:p>
+      <w:r>
+        <w:rPr>
+          <w:b w:val="0"/>
+        </w:rPr>
+        <w:t>The pills were Adderall and Ritalin. Before a workday, I told myself they were practical. The noise went quiet. The static of self-doubt dropped a few decibels. I could hear the customer instead of pretending to listen while rehearsing my next line. I closed deals. I walked into rooms that scared me and stopped feeling scared. My numbers went up.</w:t>
+      </w:r>
+    </w:p>
+    <w:p>
+      <w:r>
+        <w:rPr>
+          <w:b w:val="0"/>
+        </w:rPr>
+        <w:t>And success was the trap. If every time I took a pill, I threw up my guts, blew a sales call, and missed the next couple of days at work, I would have seen the addiction for what it was: lethal. But those pills didn't just feel good; they made me better at the thing I most needed to be good at, with money attached. I didn't see it as using. I saw it as competing.</w:t>
+      </w:r>
+    </w:p>
+    <w:p>
+      <w:r>
+        <w:rPr>
+          <w:b w:val="0"/>
+        </w:rPr>
+        <w:t>By then I had my own prescription in California. Easy access didn't satisfy the chase; it amplified it. The arithmetic was simple: more to get the same effect, then more again. When California ran dry, I crossed into Tijuana to resupply. One of those runs resulted in where I started my story: in a jail wishing I could disappear against the wall.</w:t>
+      </w:r>
+    </w:p>
+    <w:p>
+      <w:r>
+        <w:rPr>
+          <w:b w:val="0"/>
+        </w:rPr>
+        <w:t>Did the experience of a fellow cellmate scaring the living crap out of me change my behavior? Sure. Until I got out.</w:t>
+      </w:r>
+    </w:p>
+    <w:p>
+      <w:r>
+        <w:rPr>
+          <w:b w:val="0"/>
+        </w:rPr>
+        <w:t>I crossed again the next day. Which wasn't logical behavior. But addiction doesn't listen to logic. Six figures a year, crossing a border for pills because the machine I had built couldn't run without fuel.</w:t>
+      </w:r>
+    </w:p>
+    <w:p>
+      <w:r>
+        <w:rPr>
+          <w:b w:val="0"/>
+        </w:rPr>
+        <w:t>Alcohol came alongside it. Pills to ramp up, drinks to come down. I wasn't a two-beer, loosen-up drinker. I blacked out. Four nights a week, I'd wake up piecing the night together from other people's faces. Outside, the confidence read as arrogance. Inside, I was still the scared kid trying to prove he belonged.</w:t>
+      </w:r>
+    </w:p>
+    <w:p>
       <w:r>
         <w:rPr>
           <w:strike/>
           <w:color w:val="C00000"/>
         </w:rPr>
-        <w:t xml:space="preserve">"I'm </w:t>
-      </w:r>
-      <w:r>
-        <w:rPr>
-          <w:color w:val="C00000"/>
-        </w:rPr>
-        <w:t xml:space="preserve">"I </w:t>
-      </w:r>
-      <w:r>
-        <w:t xml:space="preserve">haven't decided." </w:t>
-      </w:r>
-    </w:p>
-    <w:p>
-      <w:r>
-        <w:t xml:space="preserve">I </w:t>
-      </w:r>
+        <w:t>The Wreckage</w:t>
+      </w:r>
+    </w:p>
+    <w:p>
+      <w:r>
+        <w:rPr>
+          <w:b w:val="0"/>
+        </w:rPr>
+        <w:t>By then, the thing I was feeding had swallowed most of me. I lied with my own face. I hurt people who loved me and still found ways to explain it away.</w:t>
+      </w:r>
+    </w:p>
+    <w:p>
+      <w:r>
+        <w:rPr>
+          <w:b w:val="0"/>
+        </w:rPr>
+        <w:t>There's one moment from California I can't shake. On a workday, I went to see a fortune teller. I don't even believe in them. She looked at me and said my mother cried herself to sleep worrying about me and my father was sick with concern. I sat there stunned. How could she know? Maybe it was written plainly enough on me for a stranger to read.</w:t>
+      </w:r>
+    </w:p>
+    <w:p>
+      <w:r>
+        <w:rPr>
+          <w:b w:val="0"/>
+        </w:rPr>
+        <w:t>But what the fortune teller told me was true. While I chased a feeling, the people who loved me lay awake. My mother. Nancey. Lou. Chris. I lied to them. Manipulated them. Stole. I turned their trust into fuel and left them carrying a wreckage I barely looked back at.</w:t>
+      </w:r>
+    </w:p>
+    <w:p>
+      <w:r>
+        <w:rPr>
+          <w:b w:val="0"/>
+        </w:rPr>
+        <w:t>Some of it I would make right later. Some of it I still carry.</w:t>
+      </w:r>
+    </w:p>
+    <w:p>
       <w:r>
         <w:rPr>
           <w:strike/>
           <w:color w:val="C00000"/>
         </w:rPr>
+        <w:t>The First DUI</w:t>
+      </w:r>
+    </w:p>
+    <w:p>
+      <w:r>
+        <w:rPr>
+          <w:b w:val="0"/>
+        </w:rPr>
+        <w:t>The first DUI came in 2002, and it should have stopped me. I was driving toward San Diego to see an ex-girlfriend I wasn't even in love with, holding on because letting go felt like defeat. I had been drinking. I was exhausted, strung out from work, running on momentum.</w:t>
+      </w:r>
+    </w:p>
+    <w:p>
+      <w:r>
+        <w:rPr>
+          <w:b w:val="0"/>
+        </w:rPr>
+        <w:t>I got so tired I pulled onto the shoulder near Camp Pendleton and fell asleep with the car running. Military police found me and called the cops. I tried the old pennies-in-the-mouth trick. It doesn't work.</w:t>
+      </w:r>
+    </w:p>
+    <w:p>
+      <w:r>
+        <w:rPr>
+          <w:b w:val="0"/>
+        </w:rPr>
+        <w:t>I woke up in handcuffs. The car was impounded. I spent the night in jail.</w:t>
+      </w:r>
+    </w:p>
+    <w:p>
+      <w:r>
+        <w:rPr>
+          <w:b w:val="0"/>
+        </w:rPr>
+        <w:t>The next morning, I called my boss from a payphone, my hands still shaking.</w:t>
+      </w:r>
+    </w:p>
+    <w:p>
+      <w:r>
+        <w:t xml:space="preserve">"Am I going to lose my job?" I asked </w:t>
+      </w:r>
+      <w:r>
+        <w:rPr>
+          <w:strike/>
+          <w:color w:val="C00000"/>
+        </w:rPr>
+        <w:t xml:space="preserve">my boss </w:t>
+      </w:r>
+      <w:r>
+        <w:rPr>
+          <w:color w:val="C00000"/>
+        </w:rPr>
+        <w:t xml:space="preserve">him </w:t>
+      </w:r>
+      <w:r>
+        <w:t xml:space="preserve">while fighting back tears. The situation had broken me. And by situation, I mean getting caught. </w:t>
+      </w:r>
+    </w:p>
+    <w:p>
+      <w:r>
+        <w:t xml:space="preserve">"I don't know yet, Bravo," he answered, using my work nickname. </w:t>
+      </w:r>
+      <w:r>
+        <w:rPr>
+          <w:strike/>
+          <w:color w:val="C00000"/>
+        </w:rPr>
+        <w:t xml:space="preserve">"I'm </w:t>
+      </w:r>
+      <w:r>
+        <w:rPr>
+          <w:color w:val="C00000"/>
+        </w:rPr>
+        <w:t xml:space="preserve">"I </w:t>
+      </w:r>
+      <w:r>
+        <w:t xml:space="preserve">haven't decided." </w:t>
+      </w:r>
+    </w:p>
+    <w:p>
+      <w:r>
+        <w:t xml:space="preserve">I </w:t>
+      </w:r>
+      <w:r>
+        <w:rPr>
+          <w:strike/>
+          <w:color w:val="C00000"/>
+        </w:rPr>
         <w:t xml:space="preserve">sobbed </w:t>
       </w:r>
       <w:r>
@@ -4495,7 +4535,32 @@
     </w:p>
     <w:p>
       <w:r>
-        <w:t xml:space="preserve">He kept me. A good attorney and ten thousand dollars got the DUI pled down to a wet reckless, with one condition: another DUI within ten years and the wet reckless would count as the first. The next arrest would be treated as my second. </w:t>
+        <w:t xml:space="preserve">He kept me. A good attorney and ten thousand dollars got the DUI pled down to </w:t>
+      </w:r>
+      <w:r>
+        <w:rPr>
+          <w:color w:val="C00000"/>
+        </w:rPr>
+        <w:t xml:space="preserve">what the lawyers call </w:t>
+      </w:r>
+      <w:r>
+        <w:t xml:space="preserve">a wet </w:t>
+      </w:r>
+      <w:r>
+        <w:rPr>
+          <w:strike/>
+          <w:color w:val="C00000"/>
+        </w:rPr>
+        <w:t xml:space="preserve">reckless, </w:t>
+      </w:r>
+      <w:r>
+        <w:rPr>
+          <w:color w:val="C00000"/>
+        </w:rPr>
+        <w:t xml:space="preserve">reckless: reckless driving with alcohol involved, the lesser charge you get when a DUI is bargained down. It came </w:t>
+      </w:r>
+      <w:r>
+        <w:t xml:space="preserve">with one condition: another DUI within ten years and the wet reckless would count as the first. The next arrest would be treated as my second. </w:t>
       </w:r>
       <w:r>
         <w:rPr>
@@ -4992,7 +5057,7 @@
         <w:rPr>
           <w:color w:val="C00000"/>
         </w:rPr>
-        <w:t xml:space="preserve">I stopped at a red light and looked left. A cop. I looked right. Another cop. A man with a suspended license and liquor on his breath, boxed in on both sides, in a town where nobody knew him yet. I put both hands on the wheel and held my breath. I did not look at either of them. The light took forever. </w:t>
+        <w:t xml:space="preserve">I stopped at a red light and looked left. A cop. I looked right. Another cop. I was a man with a suspended license and liquor on my breath, boxed in on both sides, in a town where nobody knew me yet. I put both hands on the wheel and held my breath. I did not look at either of them. The light took forever. </w:t>
       </w:r>
     </w:p>
     <w:p>
@@ -6198,7 +6263,23 @@
         <w:t xml:space="preserve">"How </w:t>
       </w:r>
       <w:r>
-        <w:t xml:space="preserve">long?" "About five years." "And what have you been doing since? There it was. I didn't spin it, and I didn't tell the whole story </w:t>
+        <w:t xml:space="preserve">long?" "About five years." "And what have you been doing </w:t>
+      </w:r>
+      <w:r>
+        <w:rPr>
+          <w:strike/>
+          <w:color w:val="C00000"/>
+        </w:rPr>
+        <w:t xml:space="preserve">since? </w:t>
+      </w:r>
+      <w:r>
+        <w:rPr>
+          <w:color w:val="C00000"/>
+        </w:rPr>
+        <w:t xml:space="preserve">since?" </w:t>
+      </w:r>
+      <w:r>
+        <w:t xml:space="preserve">There it was. I didn't spin it, and I didn't tell the whole story </w:t>
       </w:r>
       <w:r>
         <w:rPr>

</xml_diff>